<commit_message>
Learning AutheticationEvents which trigger on sucess or failture of authentication and we can decide if we want to do something after that.Also learned about @Slf4j which gives us log functionlity
</commit_message>
<xml_diff>
--- a/Important things.docx
+++ b/Important things.docx
@@ -1050,6 +1050,177 @@
           <w:lang w:val="en-IN"/>
         </w:rPr>
         <w:t>In spring mainly these are handeld by ExceptionTranslationFilter in that AutheticationEntryPoint interface handle all type of 401 errors and AccessDeniedHandler Interface handle all 403 errors so if we want to make any custom need to implement these for spring security exceptions.</w:t>
+      </w:r>
+    </w:p>
+    <w:p>
+      <w:pPr>
+        <w:rPr>
+          <w:rFonts w:hint="default"/>
+          <w:highlight w:val="none"/>
+          <w:lang w:val="en-IN"/>
+        </w:rPr>
+      </w:pPr>
+    </w:p>
+    <w:p>
+      <w:pPr>
+        <w:rPr>
+          <w:rFonts w:hint="default"/>
+          <w:highlight w:val="cyan"/>
+          <w:lang w:val="en-IN"/>
+        </w:rPr>
+      </w:pPr>
+      <w:r>
+        <w:rPr>
+          <w:rFonts w:hint="default"/>
+          <w:highlight w:val="cyan"/>
+          <w:lang w:val="en-IN"/>
+        </w:rPr>
+        <w:t>Session hijacking and session fixation</w:t>
+      </w:r>
+    </w:p>
+    <w:p>
+      <w:pPr>
+        <w:rPr>
+          <w:rFonts w:hint="default"/>
+          <w:highlight w:val="cyan"/>
+          <w:lang w:val="en-IN"/>
+        </w:rPr>
+      </w:pPr>
+    </w:p>
+    <w:p>
+      <w:pPr>
+        <w:rPr>
+          <w:rFonts w:hint="default"/>
+          <w:highlight w:val="none"/>
+          <w:lang w:val="en-IN"/>
+        </w:rPr>
+      </w:pPr>
+      <w:r>
+        <w:rPr>
+          <w:rFonts w:hint="default"/>
+          <w:highlight w:val="red"/>
+          <w:lang w:val="en-IN"/>
+        </w:rPr>
+        <w:t>Session hijacking-</w:t>
+      </w:r>
+      <w:r>
+        <w:rPr>
+          <w:rFonts w:hint="default"/>
+          <w:highlight w:val="none"/>
+          <w:lang w:val="en-IN"/>
+        </w:rPr>
+        <w:t xml:space="preserve"> Hacker hacks and get the session id either stored in browser cookie or url to prevent this we have to use https and also set valid time of a session id to less time.</w:t>
+      </w:r>
+    </w:p>
+    <w:p>
+      <w:pPr>
+        <w:rPr>
+          <w:rFonts w:hint="default"/>
+          <w:highlight w:val="none"/>
+          <w:lang w:val="en-IN"/>
+        </w:rPr>
+      </w:pPr>
+    </w:p>
+    <w:p>
+      <w:pPr>
+        <w:rPr>
+          <w:rFonts w:hint="default"/>
+          <w:highlight w:val="none"/>
+          <w:lang w:val="en-IN"/>
+        </w:rPr>
+      </w:pPr>
+      <w:r>
+        <w:rPr>
+          <w:rFonts w:hint="default"/>
+          <w:highlight w:val="red"/>
+          <w:lang w:val="en-IN"/>
+        </w:rPr>
+        <w:t>session fixation-</w:t>
+      </w:r>
+      <w:r>
+        <w:rPr>
+          <w:rFonts w:hint="default"/>
+          <w:highlight w:val="none"/>
+          <w:lang w:val="en-IN"/>
+        </w:rPr>
+        <w:t xml:space="preserve"> Hacker logins in and create a session and then sent a link to someone with session id in the url so once user click this link and login it will be given this same session id and then hacker can attack. To avoid this spring has inbuilt setup it uses sessionfixation (there is no need to mention if we use the default config of sessionfixation that is “change session” otherwise we need to mention if we want to use “newSession” or “migrate session”)</w:t>
+      </w:r>
+    </w:p>
+    <w:p>
+      <w:pPr>
+        <w:rPr>
+          <w:rFonts w:hint="default"/>
+          <w:highlight w:val="none"/>
+          <w:lang w:val="en-IN"/>
+        </w:rPr>
+      </w:pPr>
+    </w:p>
+    <w:p>
+      <w:pPr>
+        <w:rPr>
+          <w:rFonts w:hint="default"/>
+          <w:highlight w:val="none"/>
+          <w:lang w:val="en-IN"/>
+        </w:rPr>
+      </w:pPr>
+      <w:r>
+        <w:rPr>
+          <w:rFonts w:hint="default"/>
+          <w:highlight w:val="cyan"/>
+          <w:lang w:val="en-IN"/>
+        </w:rPr>
+        <w:t>AutheticationEvents</w:t>
+      </w:r>
+      <w:r>
+        <w:rPr>
+          <w:rFonts w:hint="default"/>
+          <w:highlight w:val="none"/>
+          <w:lang w:val="en-IN"/>
+        </w:rPr>
+        <w:t xml:space="preserve"> (Triggers when success or failure of authentication happens and we can do what we want then)</w:t>
+      </w:r>
+    </w:p>
+    <w:p>
+      <w:pPr>
+        <w:rPr>
+          <w:rFonts w:hint="default"/>
+          <w:highlight w:val="none"/>
+          <w:lang w:val="en-IN"/>
+        </w:rPr>
+      </w:pPr>
+    </w:p>
+    <w:p>
+      <w:pPr>
+        <w:rPr>
+          <w:rFonts w:hint="default"/>
+          <w:highlight w:val="none"/>
+          <w:lang w:val="en-IN"/>
+        </w:rPr>
+      </w:pPr>
+      <w:r>
+        <w:rPr>
+          <w:rFonts w:hint="default"/>
+          <w:highlight w:val="none"/>
+          <w:lang w:val="en-IN"/>
+        </w:rPr>
+        <w:t>AutheticationSuccessEvent</w:t>
+      </w:r>
+    </w:p>
+    <w:p>
+      <w:pPr>
+        <w:rPr>
+          <w:rFonts w:hint="default"/>
+          <w:highlight w:val="none"/>
+          <w:lang w:val="en-IN"/>
+        </w:rPr>
+      </w:pPr>
+      <w:r>
+        <w:rPr>
+          <w:rFonts w:hint="default"/>
+          <w:highlight w:val="none"/>
+          <w:lang w:val="en-IN"/>
+        </w:rPr>
+        <w:t>AbstractAutheticationFailtureEvent</w:t>
       </w:r>
     </w:p>
     <w:p>

</xml_diff>

<commit_message>
created angular part for this project and also made changes in db and backend spring code for the eazy bank setup
</commit_message>
<xml_diff>
--- a/Important things.docx
+++ b/Important things.docx
@@ -1177,71 +1177,131 @@
           <w:highlight w:val="none"/>
           <w:lang w:val="en-IN"/>
         </w:rPr>
-        <w:t xml:space="preserve"> (Triggers when success or failure of authentication happens and we can do what we want then)</w:t>
-      </w:r>
-    </w:p>
-    <w:p>
-      <w:pPr>
-        <w:rPr>
-          <w:rFonts w:hint="default"/>
-          <w:highlight w:val="none"/>
-          <w:lang w:val="en-IN"/>
-        </w:rPr>
-      </w:pPr>
-    </w:p>
-    <w:p>
-      <w:pPr>
-        <w:rPr>
-          <w:rFonts w:hint="default"/>
-          <w:highlight w:val="none"/>
-          <w:lang w:val="en-IN"/>
-        </w:rPr>
-      </w:pPr>
-      <w:r>
-        <w:rPr>
-          <w:rFonts w:hint="default"/>
-          <w:highlight w:val="none"/>
-          <w:lang w:val="en-IN"/>
-        </w:rPr>
-        <w:t>AutheticationSuccessEvent</w:t>
-      </w:r>
-    </w:p>
-    <w:p>
-      <w:pPr>
-        <w:rPr>
-          <w:rFonts w:hint="default"/>
-          <w:highlight w:val="none"/>
-          <w:lang w:val="en-IN"/>
-        </w:rPr>
-      </w:pPr>
-      <w:r>
-        <w:rPr>
-          <w:rFonts w:hint="default"/>
-          <w:highlight w:val="none"/>
-          <w:lang w:val="en-IN"/>
-        </w:rPr>
-        <w:t>AbstractAutheticationFailtureEvent</w:t>
-      </w:r>
-    </w:p>
-    <w:p>
-      <w:pPr>
-        <w:rPr>
-          <w:rFonts w:hint="default"/>
-          <w:highlight w:val="none"/>
-          <w:lang w:val="en-IN"/>
-        </w:rPr>
-      </w:pPr>
-    </w:p>
-    <w:p>
-      <w:pPr>
-        <w:rPr>
-          <w:rFonts w:hint="default"/>
-          <w:highlight w:val="none"/>
-          <w:lang w:val="en-IN"/>
-        </w:rPr>
-      </w:pPr>
+        <w:t xml:space="preserve"> (Triggers when success or failure of authentication happens and we can do what we want then (real life example sent email</w:t>
+      </w:r>
       <w:bookmarkStart w:id="0" w:name="_GoBack"/>
       <w:bookmarkEnd w:id="0"/>
+      <w:r>
+        <w:rPr>
+          <w:rFonts w:hint="default"/>
+          <w:highlight w:val="none"/>
+          <w:lang w:val="en-IN"/>
+        </w:rPr>
+        <w:t>))</w:t>
+      </w:r>
+    </w:p>
+    <w:p>
+      <w:pPr>
+        <w:rPr>
+          <w:rFonts w:hint="default"/>
+          <w:highlight w:val="none"/>
+          <w:lang w:val="en-IN"/>
+        </w:rPr>
+      </w:pPr>
+    </w:p>
+    <w:p>
+      <w:pPr>
+        <w:rPr>
+          <w:rFonts w:hint="default"/>
+          <w:highlight w:val="none"/>
+          <w:lang w:val="en-IN"/>
+        </w:rPr>
+      </w:pPr>
+      <w:r>
+        <w:rPr>
+          <w:rFonts w:hint="default"/>
+          <w:highlight w:val="none"/>
+          <w:lang w:val="en-IN"/>
+        </w:rPr>
+        <w:t>AutheticationSuccessEvent</w:t>
+      </w:r>
+    </w:p>
+    <w:p>
+      <w:pPr>
+        <w:rPr>
+          <w:rFonts w:hint="default"/>
+          <w:highlight w:val="none"/>
+          <w:lang w:val="en-IN"/>
+        </w:rPr>
+      </w:pPr>
+      <w:r>
+        <w:rPr>
+          <w:rFonts w:hint="default"/>
+          <w:highlight w:val="none"/>
+          <w:lang w:val="en-IN"/>
+        </w:rPr>
+        <w:t>AbstractAutheticationFailtureEvent</w:t>
+      </w:r>
+    </w:p>
+    <w:p>
+      <w:pPr>
+        <w:rPr>
+          <w:rFonts w:hint="default"/>
+          <w:highlight w:val="none"/>
+          <w:lang w:val="en-IN"/>
+        </w:rPr>
+      </w:pPr>
+    </w:p>
+    <w:p>
+      <w:pPr>
+        <w:rPr>
+          <w:rFonts w:hint="default"/>
+          <w:highlight w:val="none"/>
+          <w:lang w:val="en-IN"/>
+        </w:rPr>
+      </w:pPr>
+      <w:r>
+        <w:rPr>
+          <w:rFonts w:hint="default"/>
+          <w:highlight w:val="cyan"/>
+          <w:lang w:val="en-IN"/>
+        </w:rPr>
+        <w:t>@Slf4j</w:t>
+      </w:r>
+    </w:p>
+    <w:p>
+      <w:pPr>
+        <w:rPr>
+          <w:rFonts w:hint="default"/>
+          <w:highlight w:val="none"/>
+          <w:lang w:val="en-IN"/>
+        </w:rPr>
+      </w:pPr>
+      <w:r>
+        <w:rPr>
+          <w:rFonts w:hint="default"/>
+          <w:highlight w:val="none"/>
+          <w:lang w:val="en-IN"/>
+        </w:rPr>
+        <w:t>help us to use log without defining it like log=logger. but to use that we need to add a dependency lombok</w:t>
+      </w:r>
+    </w:p>
+    <w:p>
+      <w:pPr>
+        <w:rPr>
+          <w:rFonts w:hint="default"/>
+          <w:highlight w:val="none"/>
+          <w:lang w:val="en-IN"/>
+        </w:rPr>
+      </w:pPr>
+    </w:p>
+    <w:p>
+      <w:pPr>
+        <w:rPr>
+          <w:rFonts w:hint="default"/>
+          <w:highlight w:val="none"/>
+          <w:lang w:val="en-IN"/>
+        </w:rPr>
+      </w:pPr>
+    </w:p>
+    <w:p>
+      <w:pPr>
+        <w:rPr>
+          <w:rFonts w:hint="default"/>
+          <w:highlight w:val="none"/>
+          <w:lang w:val="en-IN"/>
+        </w:rPr>
+      </w:pPr>
     </w:p>
     <w:sectPr>
       <w:pgSz w:w="11906" w:h="16838"/>
@@ -1258,7 +1318,7 @@
   <w:docDefaults>
     <w:rPrDefault>
       <w:rPr>
-        <w:rFonts w:asciiTheme="minorHAnsi" w:hAnsiTheme="minorHAnsi" w:eastAsiaTheme="minorEastAsia" w:cstheme="minorBidi"/>
+        <w:rFonts w:ascii="Times New Roman" w:hAnsi="Times New Roman" w:eastAsia="SimSun" w:cs="Times New Roman"/>
       </w:rPr>
     </w:rPrDefault>
     <w:pPrDefault/>
@@ -1542,6 +1602,38 @@
       </w:tblCellMar>
     </w:tblPr>
   </w:style>
+  <w:style w:type="paragraph" w:styleId="4">
+    <w:name w:val="HTML Preformatted"/>
+    <w:uiPriority w:val="0"/>
+    <w:pPr>
+      <w:tabs>
+        <w:tab w:val="left" w:pos="916"/>
+        <w:tab w:val="left" w:pos="1832"/>
+        <w:tab w:val="left" w:pos="2748"/>
+        <w:tab w:val="left" w:pos="3664"/>
+        <w:tab w:val="left" w:pos="4580"/>
+        <w:tab w:val="left" w:pos="5496"/>
+        <w:tab w:val="left" w:pos="6412"/>
+        <w:tab w:val="left" w:pos="7328"/>
+        <w:tab w:val="left" w:pos="8244"/>
+        <w:tab w:val="left" w:pos="9160"/>
+        <w:tab w:val="left" w:pos="10076"/>
+        <w:tab w:val="left" w:pos="10992"/>
+        <w:tab w:val="left" w:pos="11908"/>
+        <w:tab w:val="left" w:pos="12824"/>
+        <w:tab w:val="left" w:pos="13740"/>
+        <w:tab w:val="left" w:pos="14656"/>
+      </w:tabs>
+      <w:jc w:val="left"/>
+    </w:pPr>
+    <w:rPr>
+      <w:rFonts w:hint="eastAsia" w:ascii="SimSun" w:hAnsi="SimSun" w:eastAsia="SimSun" w:cs="SimSun"/>
+      <w:kern w:val="0"/>
+      <w:sz w:val="24"/>
+      <w:szCs w:val="24"/>
+      <w:lang w:val="en-US" w:eastAsia="zh-CN" w:bidi="ar"/>
+    </w:rPr>
+  </w:style>
 </w:styles>
 </file>
 

</xml_diff>

<commit_message>
Db setuped,DAO setuped,Controller setuped,Model (entity) setuped
</commit_message>
<xml_diff>
--- a/Important things.docx
+++ b/Important things.docx
@@ -520,664 +520,7 @@
           <w:highlight w:val="none"/>
           <w:lang w:val="en-IN"/>
         </w:rPr>
-        <w:t>Normally when we use jpaRepositoy for doing database action by default we have findById,findAll etc we can also add custom methods in the interface no need to mention its content just mention function name and jpa will automatically understand and find the data. But we need to maintain some naming convention for it to understand like findByEmail so it know we need to find record with this given email</w:t>
-      </w:r>
-    </w:p>
-    <w:p>
-      <w:pPr>
-        <w:rPr>
-          <w:rFonts w:hint="default"/>
-          <w:highlight w:val="none"/>
-          <w:lang w:val="en-IN"/>
-        </w:rPr>
-      </w:pPr>
-    </w:p>
-    <w:p>
-      <w:pPr>
-        <w:rPr>
-          <w:rFonts w:hint="default"/>
-          <w:highlight w:val="cyan"/>
-          <w:lang w:val="en-IN"/>
-        </w:rPr>
-      </w:pPr>
-      <w:r>
-        <w:rPr>
-          <w:rFonts w:hint="default"/>
-          <w:highlight w:val="cyan"/>
-          <w:lang w:val="en-IN"/>
-        </w:rPr>
-        <w:t>Different ways for data privacy</w:t>
-      </w:r>
-    </w:p>
-    <w:p>
-      <w:pPr>
-        <w:rPr>
-          <w:rFonts w:hint="default"/>
-          <w:highlight w:val="cyan"/>
-          <w:lang w:val="en-IN"/>
-        </w:rPr>
-      </w:pPr>
-    </w:p>
-    <w:p>
-      <w:pPr>
-        <w:rPr>
-          <w:rFonts w:hint="default"/>
-          <w:highlight w:val="none"/>
-          <w:lang w:val="en-IN"/>
-        </w:rPr>
-      </w:pPr>
-      <w:r>
-        <w:rPr>
-          <w:rFonts w:hint="default"/>
-          <w:highlight w:val="red"/>
-          <w:lang w:val="en-IN"/>
-        </w:rPr>
-        <w:t>Encoding and Decoding</w:t>
-      </w:r>
-      <w:r>
-        <w:rPr>
-          <w:rFonts w:hint="default"/>
-          <w:highlight w:val="none"/>
-          <w:lang w:val="en-IN"/>
-        </w:rPr>
-        <w:t xml:space="preserve"> (not used to store password as it can be easily decoded. Encoding can be done using ASCII,BASE64) etc (usally used to sent images vidio where it will be sent in ecoded format and when reciever receive it will be decoded)</w:t>
-      </w:r>
-    </w:p>
-    <w:p>
-      <w:pPr>
-        <w:rPr>
-          <w:rFonts w:hint="default"/>
-          <w:highlight w:val="none"/>
-          <w:lang w:val="en-IN"/>
-        </w:rPr>
-      </w:pPr>
-    </w:p>
-    <w:p>
-      <w:pPr>
-        <w:rPr>
-          <w:rFonts w:hint="default"/>
-          <w:highlight w:val="none"/>
-          <w:lang w:val="en-IN"/>
-        </w:rPr>
-      </w:pPr>
-      <w:r>
-        <w:rPr>
-          <w:rFonts w:hint="default"/>
-          <w:highlight w:val="red"/>
-          <w:lang w:val="en-IN"/>
-        </w:rPr>
-        <w:t>Encryption and decryption</w:t>
-      </w:r>
-      <w:r>
-        <w:rPr>
-          <w:rFonts w:hint="default"/>
-          <w:highlight w:val="none"/>
-          <w:lang w:val="en-IN"/>
-        </w:rPr>
-        <w:t xml:space="preserve"> (we don’t use this for storing password as it need a key and if we lose the key then we can never verify is user entered password correct compared to encryted password stored in db) eg jwt token use this</w:t>
-      </w:r>
-    </w:p>
-    <w:p>
-      <w:pPr>
-        <w:rPr>
-          <w:rFonts w:hint="default"/>
-          <w:highlight w:val="none"/>
-          <w:lang w:val="en-IN"/>
-        </w:rPr>
-      </w:pPr>
-    </w:p>
-    <w:p>
-      <w:pPr>
-        <w:rPr>
-          <w:rFonts w:hint="default"/>
-          <w:highlight w:val="none"/>
-          <w:lang w:val="en-IN"/>
-        </w:rPr>
-      </w:pPr>
-      <w:r>
-        <w:rPr>
-          <w:rFonts w:hint="default"/>
-          <w:highlight w:val="none"/>
-          <w:lang w:val="en-IN"/>
-        </w:rPr>
-        <w:t>2 type</w:t>
-      </w:r>
-    </w:p>
-    <w:p>
-      <w:pPr>
-        <w:rPr>
-          <w:rFonts w:hint="default"/>
-          <w:highlight w:val="none"/>
-          <w:lang w:val="en-IN"/>
-        </w:rPr>
-      </w:pPr>
-    </w:p>
-    <w:p>
-      <w:pPr>
-        <w:rPr>
-          <w:rFonts w:hint="default"/>
-          <w:highlight w:val="none"/>
-          <w:lang w:val="en-IN"/>
-        </w:rPr>
-      </w:pPr>
-      <w:r>
-        <w:rPr>
-          <w:rFonts w:hint="default"/>
-          <w:highlight w:val="none"/>
-          <w:lang w:val="en-IN"/>
-        </w:rPr>
-        <w:t>Symetric-  here we just have one key and that is used for encryption and decryptiom ( the issue is secreat key is given to 3</w:t>
-      </w:r>
-      <w:r>
-        <w:rPr>
-          <w:rFonts w:hint="default"/>
-          <w:highlight w:val="none"/>
-          <w:vertAlign w:val="superscript"/>
-          <w:lang w:val="en-IN"/>
-        </w:rPr>
-        <w:t>rd</w:t>
-      </w:r>
-      <w:r>
-        <w:rPr>
-          <w:rFonts w:hint="default"/>
-          <w:highlight w:val="none"/>
-          <w:lang w:val="en-IN"/>
-        </w:rPr>
-        <w:t xml:space="preserve"> party to login like the react so if they missue it then issue)</w:t>
-      </w:r>
-    </w:p>
-    <w:p>
-      <w:pPr>
-        <w:rPr>
-          <w:rFonts w:hint="default"/>
-          <w:highlight w:val="none"/>
-          <w:lang w:val="en-IN"/>
-        </w:rPr>
-      </w:pPr>
-    </w:p>
-    <w:p>
-      <w:pPr>
-        <w:rPr>
-          <w:rFonts w:hint="default"/>
-          <w:highlight w:val="none"/>
-          <w:lang w:val="en-IN"/>
-        </w:rPr>
-      </w:pPr>
-      <w:r>
-        <w:rPr>
-          <w:rFonts w:hint="default"/>
-          <w:highlight w:val="none"/>
-          <w:lang w:val="en-IN"/>
-        </w:rPr>
-        <w:t>Ascemetric-here 2 key are generated public and private so public key is given to everyone which they use to encryt and they sent this and decrption is done using private ket and this is only there with that person (inside the main orngainzation whi genrate private and public key  people may steal private key)</w:t>
-      </w:r>
-    </w:p>
-    <w:p>
-      <w:pPr>
-        <w:rPr>
-          <w:rFonts w:hint="default"/>
-          <w:highlight w:val="none"/>
-          <w:lang w:val="en-IN"/>
-        </w:rPr>
-      </w:pPr>
-    </w:p>
-    <w:p>
-      <w:pPr>
-        <w:rPr>
-          <w:rFonts w:hint="default"/>
-          <w:highlight w:val="red"/>
-          <w:lang w:val="en-IN"/>
-        </w:rPr>
-      </w:pPr>
-      <w:r>
-        <w:rPr>
-          <w:rFonts w:hint="default"/>
-          <w:highlight w:val="red"/>
-          <w:lang w:val="en-IN"/>
-        </w:rPr>
-        <w:t>Hashing(eg bcrypt)</w:t>
-      </w:r>
-    </w:p>
-    <w:p>
-      <w:pPr>
-        <w:rPr>
-          <w:rFonts w:hint="default"/>
-          <w:highlight w:val="none"/>
-          <w:lang w:val="en-IN"/>
-        </w:rPr>
-      </w:pPr>
-    </w:p>
-    <w:p>
-      <w:pPr>
-        <w:rPr>
-          <w:rFonts w:hint="default"/>
-          <w:highlight w:val="none"/>
-          <w:lang w:val="en-IN"/>
-        </w:rPr>
-      </w:pPr>
-      <w:r>
-        <w:rPr>
-          <w:rFonts w:hint="default"/>
-          <w:highlight w:val="none"/>
-          <w:lang w:val="en-IN"/>
-        </w:rPr>
-        <w:t>Best way to store password in database is through hashing because it is one way. One hashed password cant be dehashed to get the plain password. There are many hashing method. If we decide to use one it will always produce same length result for any input we give and also if we give same input again the hashed value will also be same everytime.</w:t>
-      </w:r>
-    </w:p>
-    <w:p>
-      <w:pPr>
-        <w:rPr>
-          <w:rFonts w:hint="default"/>
-          <w:highlight w:val="none"/>
-          <w:lang w:val="en-IN"/>
-        </w:rPr>
-      </w:pPr>
-    </w:p>
-    <w:p>
-      <w:pPr>
-        <w:rPr>
-          <w:rFonts w:hint="default"/>
-          <w:highlight w:val="none"/>
-          <w:lang w:val="en-IN"/>
-        </w:rPr>
-      </w:pPr>
-      <w:r>
-        <w:rPr>
-          <w:rFonts w:hint="default"/>
-          <w:highlight w:val="none"/>
-          <w:lang w:val="en-IN"/>
-        </w:rPr>
-        <w:t>Drawbacks-</w:t>
-      </w:r>
-    </w:p>
-    <w:p>
-      <w:pPr>
-        <w:rPr>
-          <w:rFonts w:hint="default"/>
-          <w:highlight w:val="none"/>
-          <w:lang w:val="en-IN"/>
-        </w:rPr>
-      </w:pPr>
-    </w:p>
-    <w:p>
-      <w:pPr>
-        <w:rPr>
-          <w:rFonts w:hint="default"/>
-          <w:highlight w:val="none"/>
-          <w:lang w:val="en-IN"/>
-        </w:rPr>
-      </w:pPr>
-      <w:r>
-        <w:rPr>
-          <w:rFonts w:hint="default"/>
-          <w:highlight w:val="none"/>
-          <w:lang w:val="en-IN"/>
-        </w:rPr>
-        <w:t>Brute force-since each time for a password same hash is returned if hacker get access to the database they can try out different password and check if the hash matches with those hacked data</w:t>
-      </w:r>
-    </w:p>
-    <w:p>
-      <w:pPr>
-        <w:rPr>
-          <w:rFonts w:hint="default"/>
-          <w:highlight w:val="none"/>
-          <w:lang w:val="en-IN"/>
-        </w:rPr>
-      </w:pPr>
-    </w:p>
-    <w:p>
-      <w:pPr>
-        <w:rPr>
-          <w:rFonts w:hint="default"/>
-          <w:highlight w:val="none"/>
-          <w:lang w:val="en-IN"/>
-        </w:rPr>
-      </w:pPr>
-      <w:r>
-        <w:rPr>
-          <w:rFonts w:hint="default"/>
-          <w:highlight w:val="none"/>
-          <w:vertAlign w:val="baseline"/>
-          <w:lang w:val="en-IN"/>
-        </w:rPr>
-        <w:t xml:space="preserve">Table issue- All possible passwords hash are already stored in a table </w:t>
-      </w:r>
-    </w:p>
-    <w:p>
-      <w:pPr>
-        <w:rPr>
-          <w:rFonts w:hint="default"/>
-          <w:highlight w:val="none"/>
-          <w:lang w:val="en-IN"/>
-        </w:rPr>
-      </w:pPr>
-    </w:p>
-    <w:p>
-      <w:pPr>
-        <w:rPr>
-          <w:rFonts w:hint="default"/>
-          <w:highlight w:val="none"/>
-          <w:lang w:val="en-IN"/>
-        </w:rPr>
-      </w:pPr>
-      <w:r>
-        <w:rPr>
-          <w:rFonts w:hint="default"/>
-          <w:highlight w:val="none"/>
-          <w:lang w:val="en-IN"/>
-        </w:rPr>
-        <w:t>Overcome drawbacks</w:t>
-      </w:r>
-    </w:p>
-    <w:p>
-      <w:pPr>
-        <w:rPr>
-          <w:rFonts w:hint="default"/>
-          <w:highlight w:val="none"/>
-          <w:vertAlign w:val="baseline"/>
-          <w:lang w:val="en-IN"/>
-        </w:rPr>
-      </w:pPr>
-    </w:p>
-    <w:p>
-      <w:pPr>
-        <w:rPr>
-          <w:rFonts w:hint="default"/>
-          <w:highlight w:val="none"/>
-          <w:vertAlign w:val="baseline"/>
-          <w:lang w:val="en-IN"/>
-        </w:rPr>
-      </w:pPr>
-      <w:r>
-        <w:rPr>
-          <w:rFonts w:hint="default"/>
-          <w:highlight w:val="none"/>
-          <w:vertAlign w:val="baseline"/>
-          <w:lang w:val="en-IN"/>
-        </w:rPr>
-        <w:t>Along with the password entered by the user we add a salt to it which is randomly generated and then store the hashed password (hash is calculated using both) in the db along with salt used. Because of this for each user password will be differently stored in db even if they entered same password. (solve table issue)</w:t>
-      </w:r>
-    </w:p>
-    <w:p>
-      <w:pPr>
-        <w:rPr>
-          <w:rFonts w:hint="default"/>
-          <w:highlight w:val="none"/>
-          <w:vertAlign w:val="baseline"/>
-          <w:lang w:val="en-IN"/>
-        </w:rPr>
-      </w:pPr>
-    </w:p>
-    <w:p>
-      <w:pPr>
-        <w:rPr>
-          <w:rFonts w:hint="default"/>
-          <w:highlight w:val="none"/>
-          <w:vertAlign w:val="baseline"/>
-          <w:lang w:val="en-IN"/>
-        </w:rPr>
-      </w:pPr>
-      <w:r>
-        <w:rPr>
-          <w:rFonts w:hint="default"/>
-          <w:highlight w:val="none"/>
-          <w:vertAlign w:val="baseline"/>
-          <w:lang w:val="en-IN"/>
-        </w:rPr>
-        <w:t>Also we have to use methods like bcrypts to slow down the hash generation process so that the hacker will take more time to generate hash value.  (solve brute force issue)</w:t>
-      </w:r>
-    </w:p>
-    <w:p>
-      <w:pPr>
-        <w:rPr>
-          <w:rFonts w:hint="default"/>
-          <w:highlight w:val="none"/>
-          <w:vertAlign w:val="baseline"/>
-          <w:lang w:val="en-IN"/>
-        </w:rPr>
-      </w:pPr>
-    </w:p>
-    <w:p>
-      <w:pPr>
-        <w:rPr>
-          <w:rFonts w:hint="default"/>
-          <w:highlight w:val="cyan"/>
-          <w:vertAlign w:val="baseline"/>
-          <w:lang w:val="en-IN"/>
-        </w:rPr>
-      </w:pPr>
-      <w:r>
-        <w:rPr>
-          <w:rFonts w:hint="default"/>
-          <w:highlight w:val="cyan"/>
-          <w:vertAlign w:val="baseline"/>
-          <w:lang w:val="en-IN"/>
-        </w:rPr>
-        <w:t>When we use password encoder in spring boot it does both automatically add salt and bcrpt hashing</w:t>
-      </w:r>
-    </w:p>
-    <w:p>
-      <w:pPr>
-        <w:rPr>
-          <w:rFonts w:hint="default"/>
-          <w:highlight w:val="cyan"/>
-          <w:lang w:val="en-IN"/>
-        </w:rPr>
-      </w:pPr>
-    </w:p>
-    <w:p>
-      <w:pPr>
-        <w:rPr>
-          <w:rFonts w:hint="default"/>
-          <w:highlight w:val="cyan"/>
-          <w:lang w:val="en-IN"/>
-        </w:rPr>
-      </w:pPr>
-    </w:p>
-    <w:p>
-      <w:pPr>
-        <w:rPr>
-          <w:rFonts w:hint="default"/>
-          <w:highlight w:val="cyan"/>
-          <w:lang w:val="en-IN"/>
-        </w:rPr>
-      </w:pPr>
-    </w:p>
-    <w:p>
-      <w:pPr>
-        <w:rPr>
-          <w:rFonts w:hint="default"/>
-          <w:highlight w:val="cyan"/>
-          <w:lang w:val="en-IN"/>
-        </w:rPr>
-      </w:pPr>
-      <w:r>
-        <w:rPr>
-          <w:rFonts w:hint="default"/>
-          <w:highlight w:val="cyan"/>
-          <w:lang w:val="en-IN"/>
-        </w:rPr>
-        <w:t>Custom exception handelling in spring for spring security</w:t>
-      </w:r>
-    </w:p>
-    <w:p>
-      <w:pPr>
-        <w:rPr>
-          <w:rFonts w:hint="default"/>
-          <w:highlight w:val="cyan"/>
-          <w:lang w:val="en-IN"/>
-        </w:rPr>
-      </w:pPr>
-    </w:p>
-    <w:p>
-      <w:pPr>
-        <w:rPr>
-          <w:rFonts w:hint="default"/>
-          <w:highlight w:val="none"/>
-          <w:lang w:val="en-IN"/>
-        </w:rPr>
-      </w:pPr>
-      <w:r>
-        <w:rPr>
-          <w:rFonts w:hint="default"/>
-          <w:highlight w:val="none"/>
-          <w:lang w:val="en-IN"/>
-        </w:rPr>
-        <w:t xml:space="preserve">There are mainly two type error 400 not authenticated (wrong credential)  and 403 not authorized (no role) </w:t>
-      </w:r>
-    </w:p>
-    <w:p>
-      <w:pPr>
-        <w:rPr>
-          <w:rFonts w:hint="default"/>
-          <w:highlight w:val="none"/>
-          <w:lang w:val="en-IN"/>
-        </w:rPr>
-      </w:pPr>
-    </w:p>
-    <w:p>
-      <w:pPr>
-        <w:rPr>
-          <w:rFonts w:hint="default"/>
-          <w:highlight w:val="none"/>
-          <w:lang w:val="en-IN"/>
-        </w:rPr>
-      </w:pPr>
-      <w:r>
-        <w:rPr>
-          <w:rFonts w:hint="default"/>
-          <w:highlight w:val="none"/>
-          <w:lang w:val="en-IN"/>
-        </w:rPr>
-        <w:t>In spring mainly these are handeld by ExceptionTranslationFilter in that AutheticationEntryPoint interface handle all type of 401 errors and AccessDeniedHandler Interface handle all 403 errors so if we want to make any custom need to implement these for spring security exceptions.</w:t>
-      </w:r>
-    </w:p>
-    <w:p>
-      <w:pPr>
-        <w:rPr>
-          <w:rFonts w:hint="default"/>
-          <w:highlight w:val="none"/>
-          <w:lang w:val="en-IN"/>
-        </w:rPr>
-      </w:pPr>
-    </w:p>
-    <w:p>
-      <w:pPr>
-        <w:rPr>
-          <w:rFonts w:hint="default"/>
-          <w:highlight w:val="cyan"/>
-          <w:lang w:val="en-IN"/>
-        </w:rPr>
-      </w:pPr>
-      <w:r>
-        <w:rPr>
-          <w:rFonts w:hint="default"/>
-          <w:highlight w:val="cyan"/>
-          <w:lang w:val="en-IN"/>
-        </w:rPr>
-        <w:t>Session hijacking and session fixation</w:t>
-      </w:r>
-    </w:p>
-    <w:p>
-      <w:pPr>
-        <w:rPr>
-          <w:rFonts w:hint="default"/>
-          <w:highlight w:val="cyan"/>
-          <w:lang w:val="en-IN"/>
-        </w:rPr>
-      </w:pPr>
-    </w:p>
-    <w:p>
-      <w:pPr>
-        <w:rPr>
-          <w:rFonts w:hint="default"/>
-          <w:highlight w:val="none"/>
-          <w:lang w:val="en-IN"/>
-        </w:rPr>
-      </w:pPr>
-      <w:r>
-        <w:rPr>
-          <w:rFonts w:hint="default"/>
-          <w:highlight w:val="red"/>
-          <w:lang w:val="en-IN"/>
-        </w:rPr>
-        <w:t>Session hijacking-</w:t>
-      </w:r>
-      <w:r>
-        <w:rPr>
-          <w:rFonts w:hint="default"/>
-          <w:highlight w:val="none"/>
-          <w:lang w:val="en-IN"/>
-        </w:rPr>
-        <w:t xml:space="preserve"> Hacker hacks and get the session id either stored in browser cookie or url to prevent this we have to use https and also set valid time of a session id to less time.</w:t>
-      </w:r>
-    </w:p>
-    <w:p>
-      <w:pPr>
-        <w:rPr>
-          <w:rFonts w:hint="default"/>
-          <w:highlight w:val="none"/>
-          <w:lang w:val="en-IN"/>
-        </w:rPr>
-      </w:pPr>
-    </w:p>
-    <w:p>
-      <w:pPr>
-        <w:rPr>
-          <w:rFonts w:hint="default"/>
-          <w:highlight w:val="none"/>
-          <w:lang w:val="en-IN"/>
-        </w:rPr>
-      </w:pPr>
-      <w:r>
-        <w:rPr>
-          <w:rFonts w:hint="default"/>
-          <w:highlight w:val="red"/>
-          <w:lang w:val="en-IN"/>
-        </w:rPr>
-        <w:t>session fixation-</w:t>
-      </w:r>
-      <w:r>
-        <w:rPr>
-          <w:rFonts w:hint="default"/>
-          <w:highlight w:val="none"/>
-          <w:lang w:val="en-IN"/>
-        </w:rPr>
-        <w:t xml:space="preserve"> Hacker logins in and create a session and then sent a link to someone with session id in the url so once user click this link and login it will be given this same session id and then hacker can attack. To avoid this spring has inbuilt setup it uses sessionfixation (there is no need to mention if we use the default config of sessionfixation that is “change session” otherwise we need to mention if we want to use “newSession” or “migrate session”)</w:t>
-      </w:r>
-    </w:p>
-    <w:p>
-      <w:pPr>
-        <w:rPr>
-          <w:rFonts w:hint="default"/>
-          <w:highlight w:val="none"/>
-          <w:lang w:val="en-IN"/>
-        </w:rPr>
-      </w:pPr>
-    </w:p>
-    <w:p>
-      <w:pPr>
-        <w:rPr>
-          <w:rFonts w:hint="default"/>
-          <w:highlight w:val="none"/>
-          <w:lang w:val="en-IN"/>
-        </w:rPr>
-      </w:pPr>
-      <w:r>
-        <w:rPr>
-          <w:rFonts w:hint="default"/>
-          <w:highlight w:val="cyan"/>
-          <w:lang w:val="en-IN"/>
-        </w:rPr>
-        <w:t>AutheticationEvents</w:t>
-      </w:r>
-      <w:r>
-        <w:rPr>
-          <w:rFonts w:hint="default"/>
-          <w:highlight w:val="none"/>
-          <w:lang w:val="en-IN"/>
-        </w:rPr>
-        <w:t xml:space="preserve"> (Triggers when success or failure of authentication happens and we can do what we want then (real life example sent email</w:t>
+        <w:t>Normally when we use jpaRepositoy for doing database action by default we have findById,findAll etc we can also add custom methods in the interface no need to mention its content just mention function name and jpa will automatically understand and find the data. But w</w:t>
       </w:r>
       <w:bookmarkStart w:id="0" w:name="_GoBack"/>
       <w:bookmarkEnd w:id="0"/>
@@ -1187,7 +530,716 @@
           <w:highlight w:val="none"/>
           <w:lang w:val="en-IN"/>
         </w:rPr>
-        <w:t>))</w:t>
+        <w:t>e need to maintain some naming convention for it to understand like findByEmail so it know we need to find record with this given email</w:t>
+      </w:r>
+    </w:p>
+    <w:p>
+      <w:pPr>
+        <w:rPr>
+          <w:rFonts w:hint="default"/>
+          <w:highlight w:val="none"/>
+          <w:lang w:val="en-IN"/>
+        </w:rPr>
+      </w:pPr>
+    </w:p>
+    <w:p>
+      <w:pPr>
+        <w:rPr>
+          <w:rFonts w:hint="default"/>
+          <w:highlight w:val="none"/>
+          <w:lang w:val="en-IN"/>
+        </w:rPr>
+      </w:pPr>
+      <w:r>
+        <w:rPr>
+          <w:rFonts w:hint="default"/>
+          <w:highlight w:val="none"/>
+          <w:lang w:val="en-IN"/>
+        </w:rPr>
+        <w:t xml:space="preserve">We also have @Query where we can mention anything like the createQueryt in the otherone </w:t>
+      </w:r>
+    </w:p>
+    <w:p>
+      <w:pPr>
+        <w:rPr>
+          <w:rFonts w:hint="default"/>
+          <w:highlight w:val="none"/>
+          <w:lang w:val="en-IN"/>
+        </w:rPr>
+      </w:pPr>
+      <w:r>
+        <w:rPr>
+          <w:rFonts w:hint="default"/>
+          <w:highlight w:val="none"/>
+          <w:lang w:val="en-IN"/>
+        </w:rPr>
+        <w:t>Check project “spring security eazybank-backend”</w:t>
+      </w:r>
+    </w:p>
+    <w:p>
+      <w:pPr>
+        <w:rPr>
+          <w:rFonts w:hint="default"/>
+          <w:highlight w:val="none"/>
+          <w:lang w:val="en-IN"/>
+        </w:rPr>
+      </w:pPr>
+    </w:p>
+    <w:p>
+      <w:pPr>
+        <w:rPr>
+          <w:rFonts w:hint="default"/>
+          <w:highlight w:val="cyan"/>
+          <w:lang w:val="en-IN"/>
+        </w:rPr>
+      </w:pPr>
+      <w:r>
+        <w:rPr>
+          <w:rFonts w:hint="default"/>
+          <w:highlight w:val="cyan"/>
+          <w:lang w:val="en-IN"/>
+        </w:rPr>
+        <w:t>Different ways for data privacy</w:t>
+      </w:r>
+    </w:p>
+    <w:p>
+      <w:pPr>
+        <w:rPr>
+          <w:rFonts w:hint="default"/>
+          <w:highlight w:val="cyan"/>
+          <w:lang w:val="en-IN"/>
+        </w:rPr>
+      </w:pPr>
+    </w:p>
+    <w:p>
+      <w:pPr>
+        <w:rPr>
+          <w:rFonts w:hint="default"/>
+          <w:highlight w:val="none"/>
+          <w:lang w:val="en-IN"/>
+        </w:rPr>
+      </w:pPr>
+      <w:r>
+        <w:rPr>
+          <w:rFonts w:hint="default"/>
+          <w:highlight w:val="red"/>
+          <w:lang w:val="en-IN"/>
+        </w:rPr>
+        <w:t>Encoding and Decoding</w:t>
+      </w:r>
+      <w:r>
+        <w:rPr>
+          <w:rFonts w:hint="default"/>
+          <w:highlight w:val="none"/>
+          <w:lang w:val="en-IN"/>
+        </w:rPr>
+        <w:t xml:space="preserve"> (not used to store password as it can be easily decoded. Encoding can be done using ASCII,BASE64) etc (usally used to sent images vidio where it will be sent in ecoded format and when reciever receive it will be decoded)</w:t>
+      </w:r>
+    </w:p>
+    <w:p>
+      <w:pPr>
+        <w:rPr>
+          <w:rFonts w:hint="default"/>
+          <w:highlight w:val="none"/>
+          <w:lang w:val="en-IN"/>
+        </w:rPr>
+      </w:pPr>
+    </w:p>
+    <w:p>
+      <w:pPr>
+        <w:rPr>
+          <w:rFonts w:hint="default"/>
+          <w:highlight w:val="none"/>
+          <w:lang w:val="en-IN"/>
+        </w:rPr>
+      </w:pPr>
+      <w:r>
+        <w:rPr>
+          <w:rFonts w:hint="default"/>
+          <w:highlight w:val="red"/>
+          <w:lang w:val="en-IN"/>
+        </w:rPr>
+        <w:t>Encryption and decryption</w:t>
+      </w:r>
+      <w:r>
+        <w:rPr>
+          <w:rFonts w:hint="default"/>
+          <w:highlight w:val="none"/>
+          <w:lang w:val="en-IN"/>
+        </w:rPr>
+        <w:t xml:space="preserve"> (we don’t use this for storing password as it need a key and if we lose the key then we can never verify is user entered password correct compared to encryted password stored in db) eg jwt token use this</w:t>
+      </w:r>
+    </w:p>
+    <w:p>
+      <w:pPr>
+        <w:rPr>
+          <w:rFonts w:hint="default"/>
+          <w:highlight w:val="none"/>
+          <w:lang w:val="en-IN"/>
+        </w:rPr>
+      </w:pPr>
+    </w:p>
+    <w:p>
+      <w:pPr>
+        <w:rPr>
+          <w:rFonts w:hint="default"/>
+          <w:highlight w:val="none"/>
+          <w:lang w:val="en-IN"/>
+        </w:rPr>
+      </w:pPr>
+      <w:r>
+        <w:rPr>
+          <w:rFonts w:hint="default"/>
+          <w:highlight w:val="none"/>
+          <w:lang w:val="en-IN"/>
+        </w:rPr>
+        <w:t>2 type</w:t>
+      </w:r>
+    </w:p>
+    <w:p>
+      <w:pPr>
+        <w:rPr>
+          <w:rFonts w:hint="default"/>
+          <w:highlight w:val="none"/>
+          <w:lang w:val="en-IN"/>
+        </w:rPr>
+      </w:pPr>
+    </w:p>
+    <w:p>
+      <w:pPr>
+        <w:rPr>
+          <w:rFonts w:hint="default"/>
+          <w:highlight w:val="none"/>
+          <w:lang w:val="en-IN"/>
+        </w:rPr>
+      </w:pPr>
+      <w:r>
+        <w:rPr>
+          <w:rFonts w:hint="default"/>
+          <w:highlight w:val="none"/>
+          <w:lang w:val="en-IN"/>
+        </w:rPr>
+        <w:t>Symetric-  here we just have one key and that is used for encryption and decryptiom ( the issue is secreat key is given to 3</w:t>
+      </w:r>
+      <w:r>
+        <w:rPr>
+          <w:rFonts w:hint="default"/>
+          <w:highlight w:val="none"/>
+          <w:vertAlign w:val="superscript"/>
+          <w:lang w:val="en-IN"/>
+        </w:rPr>
+        <w:t>rd</w:t>
+      </w:r>
+      <w:r>
+        <w:rPr>
+          <w:rFonts w:hint="default"/>
+          <w:highlight w:val="none"/>
+          <w:lang w:val="en-IN"/>
+        </w:rPr>
+        <w:t xml:space="preserve"> party to login like the react so if they missue it then issue)</w:t>
+      </w:r>
+    </w:p>
+    <w:p>
+      <w:pPr>
+        <w:rPr>
+          <w:rFonts w:hint="default"/>
+          <w:highlight w:val="none"/>
+          <w:lang w:val="en-IN"/>
+        </w:rPr>
+      </w:pPr>
+    </w:p>
+    <w:p>
+      <w:pPr>
+        <w:rPr>
+          <w:rFonts w:hint="default"/>
+          <w:highlight w:val="none"/>
+          <w:lang w:val="en-IN"/>
+        </w:rPr>
+      </w:pPr>
+      <w:r>
+        <w:rPr>
+          <w:rFonts w:hint="default"/>
+          <w:highlight w:val="none"/>
+          <w:lang w:val="en-IN"/>
+        </w:rPr>
+        <w:t>Ascemetric-here 2 key are generated public and private so public key is given to everyone which they use to encryt and they sent this and decrption is done using private ket and this is only there with that person (inside the main orngainzation whi genrate private and public key  people may steal private key)</w:t>
+      </w:r>
+    </w:p>
+    <w:p>
+      <w:pPr>
+        <w:rPr>
+          <w:rFonts w:hint="default"/>
+          <w:highlight w:val="none"/>
+          <w:lang w:val="en-IN"/>
+        </w:rPr>
+      </w:pPr>
+    </w:p>
+    <w:p>
+      <w:pPr>
+        <w:rPr>
+          <w:rFonts w:hint="default"/>
+          <w:highlight w:val="red"/>
+          <w:lang w:val="en-IN"/>
+        </w:rPr>
+      </w:pPr>
+      <w:r>
+        <w:rPr>
+          <w:rFonts w:hint="default"/>
+          <w:highlight w:val="red"/>
+          <w:lang w:val="en-IN"/>
+        </w:rPr>
+        <w:t>Hashing(eg bcrypt)</w:t>
+      </w:r>
+    </w:p>
+    <w:p>
+      <w:pPr>
+        <w:rPr>
+          <w:rFonts w:hint="default"/>
+          <w:highlight w:val="none"/>
+          <w:lang w:val="en-IN"/>
+        </w:rPr>
+      </w:pPr>
+    </w:p>
+    <w:p>
+      <w:pPr>
+        <w:rPr>
+          <w:rFonts w:hint="default"/>
+          <w:highlight w:val="none"/>
+          <w:lang w:val="en-IN"/>
+        </w:rPr>
+      </w:pPr>
+      <w:r>
+        <w:rPr>
+          <w:rFonts w:hint="default"/>
+          <w:highlight w:val="none"/>
+          <w:lang w:val="en-IN"/>
+        </w:rPr>
+        <w:t>Best way to store password in database is through hashing because it is one way. One hashed password cant be dehashed to get the plain password. There are many hashing method. If we decide to use one it will always produce same length result for any input we give and also if we give same input again the hashed value will also be same everytime.</w:t>
+      </w:r>
+    </w:p>
+    <w:p>
+      <w:pPr>
+        <w:rPr>
+          <w:rFonts w:hint="default"/>
+          <w:highlight w:val="none"/>
+          <w:lang w:val="en-IN"/>
+        </w:rPr>
+      </w:pPr>
+    </w:p>
+    <w:p>
+      <w:pPr>
+        <w:rPr>
+          <w:rFonts w:hint="default"/>
+          <w:highlight w:val="none"/>
+          <w:lang w:val="en-IN"/>
+        </w:rPr>
+      </w:pPr>
+      <w:r>
+        <w:rPr>
+          <w:rFonts w:hint="default"/>
+          <w:highlight w:val="none"/>
+          <w:lang w:val="en-IN"/>
+        </w:rPr>
+        <w:t>Drawbacks-</w:t>
+      </w:r>
+    </w:p>
+    <w:p>
+      <w:pPr>
+        <w:rPr>
+          <w:rFonts w:hint="default"/>
+          <w:highlight w:val="none"/>
+          <w:lang w:val="en-IN"/>
+        </w:rPr>
+      </w:pPr>
+    </w:p>
+    <w:p>
+      <w:pPr>
+        <w:rPr>
+          <w:rFonts w:hint="default"/>
+          <w:highlight w:val="none"/>
+          <w:lang w:val="en-IN"/>
+        </w:rPr>
+      </w:pPr>
+      <w:r>
+        <w:rPr>
+          <w:rFonts w:hint="default"/>
+          <w:highlight w:val="none"/>
+          <w:lang w:val="en-IN"/>
+        </w:rPr>
+        <w:t>Brute force-since each time for a password same hash is returned if hacker get access to the database they can try out different password and check if the hash matches with those hacked data</w:t>
+      </w:r>
+    </w:p>
+    <w:p>
+      <w:pPr>
+        <w:rPr>
+          <w:rFonts w:hint="default"/>
+          <w:highlight w:val="none"/>
+          <w:lang w:val="en-IN"/>
+        </w:rPr>
+      </w:pPr>
+    </w:p>
+    <w:p>
+      <w:pPr>
+        <w:rPr>
+          <w:rFonts w:hint="default"/>
+          <w:highlight w:val="none"/>
+          <w:lang w:val="en-IN"/>
+        </w:rPr>
+      </w:pPr>
+      <w:r>
+        <w:rPr>
+          <w:rFonts w:hint="default"/>
+          <w:highlight w:val="none"/>
+          <w:vertAlign w:val="baseline"/>
+          <w:lang w:val="en-IN"/>
+        </w:rPr>
+        <w:t xml:space="preserve">Table issue- All possible passwords hash are already stored in a table </w:t>
+      </w:r>
+    </w:p>
+    <w:p>
+      <w:pPr>
+        <w:rPr>
+          <w:rFonts w:hint="default"/>
+          <w:highlight w:val="none"/>
+          <w:lang w:val="en-IN"/>
+        </w:rPr>
+      </w:pPr>
+    </w:p>
+    <w:p>
+      <w:pPr>
+        <w:rPr>
+          <w:rFonts w:hint="default"/>
+          <w:highlight w:val="none"/>
+          <w:lang w:val="en-IN"/>
+        </w:rPr>
+      </w:pPr>
+      <w:r>
+        <w:rPr>
+          <w:rFonts w:hint="default"/>
+          <w:highlight w:val="none"/>
+          <w:lang w:val="en-IN"/>
+        </w:rPr>
+        <w:t>Overcome drawbacks</w:t>
+      </w:r>
+    </w:p>
+    <w:p>
+      <w:pPr>
+        <w:rPr>
+          <w:rFonts w:hint="default"/>
+          <w:highlight w:val="none"/>
+          <w:vertAlign w:val="baseline"/>
+          <w:lang w:val="en-IN"/>
+        </w:rPr>
+      </w:pPr>
+    </w:p>
+    <w:p>
+      <w:pPr>
+        <w:rPr>
+          <w:rFonts w:hint="default"/>
+          <w:highlight w:val="none"/>
+          <w:vertAlign w:val="baseline"/>
+          <w:lang w:val="en-IN"/>
+        </w:rPr>
+      </w:pPr>
+      <w:r>
+        <w:rPr>
+          <w:rFonts w:hint="default"/>
+          <w:highlight w:val="none"/>
+          <w:vertAlign w:val="baseline"/>
+          <w:lang w:val="en-IN"/>
+        </w:rPr>
+        <w:t>Along with the password entered by the user we add a salt to it which is randomly generated and then store the hashed password (hash is calculated using both) in the db along with salt used. Because of this for each user password will be differently stored in db even if they entered same password. (solve table issue)</w:t>
+      </w:r>
+    </w:p>
+    <w:p>
+      <w:pPr>
+        <w:rPr>
+          <w:rFonts w:hint="default"/>
+          <w:highlight w:val="none"/>
+          <w:vertAlign w:val="baseline"/>
+          <w:lang w:val="en-IN"/>
+        </w:rPr>
+      </w:pPr>
+    </w:p>
+    <w:p>
+      <w:pPr>
+        <w:rPr>
+          <w:rFonts w:hint="default"/>
+          <w:highlight w:val="none"/>
+          <w:vertAlign w:val="baseline"/>
+          <w:lang w:val="en-IN"/>
+        </w:rPr>
+      </w:pPr>
+      <w:r>
+        <w:rPr>
+          <w:rFonts w:hint="default"/>
+          <w:highlight w:val="none"/>
+          <w:vertAlign w:val="baseline"/>
+          <w:lang w:val="en-IN"/>
+        </w:rPr>
+        <w:t>Also we have to use methods like bcrypts to slow down the hash generation process so that the hacker will take more time to generate hash value.  (solve brute force issue)</w:t>
+      </w:r>
+    </w:p>
+    <w:p>
+      <w:pPr>
+        <w:rPr>
+          <w:rFonts w:hint="default"/>
+          <w:highlight w:val="none"/>
+          <w:vertAlign w:val="baseline"/>
+          <w:lang w:val="en-IN"/>
+        </w:rPr>
+      </w:pPr>
+    </w:p>
+    <w:p>
+      <w:pPr>
+        <w:rPr>
+          <w:rFonts w:hint="default"/>
+          <w:highlight w:val="cyan"/>
+          <w:vertAlign w:val="baseline"/>
+          <w:lang w:val="en-IN"/>
+        </w:rPr>
+      </w:pPr>
+      <w:r>
+        <w:rPr>
+          <w:rFonts w:hint="default"/>
+          <w:highlight w:val="cyan"/>
+          <w:vertAlign w:val="baseline"/>
+          <w:lang w:val="en-IN"/>
+        </w:rPr>
+        <w:t>When we use password encoder in spring boot it does both automatically add salt and bcrpt hashing</w:t>
+      </w:r>
+    </w:p>
+    <w:p>
+      <w:pPr>
+        <w:rPr>
+          <w:rFonts w:hint="default"/>
+          <w:highlight w:val="cyan"/>
+          <w:lang w:val="en-IN"/>
+        </w:rPr>
+      </w:pPr>
+    </w:p>
+    <w:p>
+      <w:pPr>
+        <w:rPr>
+          <w:rFonts w:hint="default"/>
+          <w:highlight w:val="cyan"/>
+          <w:lang w:val="en-IN"/>
+        </w:rPr>
+      </w:pPr>
+    </w:p>
+    <w:p>
+      <w:pPr>
+        <w:rPr>
+          <w:rFonts w:hint="default"/>
+          <w:highlight w:val="cyan"/>
+          <w:lang w:val="en-IN"/>
+        </w:rPr>
+      </w:pPr>
+    </w:p>
+    <w:p>
+      <w:pPr>
+        <w:rPr>
+          <w:rFonts w:hint="default"/>
+          <w:highlight w:val="cyan"/>
+          <w:lang w:val="en-IN"/>
+        </w:rPr>
+      </w:pPr>
+      <w:r>
+        <w:rPr>
+          <w:rFonts w:hint="default"/>
+          <w:highlight w:val="cyan"/>
+          <w:lang w:val="en-IN"/>
+        </w:rPr>
+        <w:t>Custom exception handelling in spring for spring security</w:t>
+      </w:r>
+    </w:p>
+    <w:p>
+      <w:pPr>
+        <w:rPr>
+          <w:rFonts w:hint="default"/>
+          <w:highlight w:val="cyan"/>
+          <w:lang w:val="en-IN"/>
+        </w:rPr>
+      </w:pPr>
+    </w:p>
+    <w:p>
+      <w:pPr>
+        <w:rPr>
+          <w:rFonts w:hint="default"/>
+          <w:highlight w:val="none"/>
+          <w:lang w:val="en-IN"/>
+        </w:rPr>
+      </w:pPr>
+      <w:r>
+        <w:rPr>
+          <w:rFonts w:hint="default"/>
+          <w:highlight w:val="none"/>
+          <w:lang w:val="en-IN"/>
+        </w:rPr>
+        <w:t xml:space="preserve">There are mainly two type error 401 not authenticated (wrong credential)  and 403 not authorized (no role) </w:t>
+      </w:r>
+    </w:p>
+    <w:p>
+      <w:pPr>
+        <w:rPr>
+          <w:rFonts w:hint="default"/>
+          <w:highlight w:val="none"/>
+          <w:lang w:val="en-IN"/>
+        </w:rPr>
+      </w:pPr>
+    </w:p>
+    <w:p>
+      <w:pPr>
+        <w:rPr>
+          <w:rFonts w:hint="default"/>
+          <w:highlight w:val="none"/>
+          <w:lang w:val="en-IN"/>
+        </w:rPr>
+      </w:pPr>
+      <w:r>
+        <w:rPr>
+          <w:rFonts w:hint="default"/>
+          <w:highlight w:val="none"/>
+          <w:lang w:val="en-IN"/>
+        </w:rPr>
+        <w:t>In spring mainly these are handeld by ExceptionTranslationFilter in that AutheticationEntryPoint interface handle all type of 401 errors and AccessDeniedHandler Interface handle all 403 errors so if we want to make any custom need to implement these for spring security exceptions.</w:t>
+      </w:r>
+    </w:p>
+    <w:p>
+      <w:pPr>
+        <w:rPr>
+          <w:rFonts w:hint="default"/>
+          <w:highlight w:val="none"/>
+          <w:lang w:val="en-IN"/>
+        </w:rPr>
+      </w:pPr>
+    </w:p>
+    <w:p>
+      <w:pPr>
+        <w:rPr>
+          <w:rFonts w:hint="default"/>
+          <w:highlight w:val="cyan"/>
+          <w:lang w:val="en-IN"/>
+        </w:rPr>
+      </w:pPr>
+      <w:r>
+        <w:rPr>
+          <w:rFonts w:hint="default"/>
+          <w:highlight w:val="cyan"/>
+          <w:lang w:val="en-IN"/>
+        </w:rPr>
+        <w:t>Session hijacking and session fixation</w:t>
+      </w:r>
+    </w:p>
+    <w:p>
+      <w:pPr>
+        <w:rPr>
+          <w:rFonts w:hint="default"/>
+          <w:highlight w:val="cyan"/>
+          <w:lang w:val="en-IN"/>
+        </w:rPr>
+      </w:pPr>
+    </w:p>
+    <w:p>
+      <w:pPr>
+        <w:rPr>
+          <w:rFonts w:hint="default"/>
+          <w:highlight w:val="none"/>
+          <w:lang w:val="en-IN"/>
+        </w:rPr>
+      </w:pPr>
+      <w:r>
+        <w:rPr>
+          <w:rFonts w:hint="default"/>
+          <w:highlight w:val="red"/>
+          <w:lang w:val="en-IN"/>
+        </w:rPr>
+        <w:t>Session hijacking-</w:t>
+      </w:r>
+      <w:r>
+        <w:rPr>
+          <w:rFonts w:hint="default"/>
+          <w:highlight w:val="none"/>
+          <w:lang w:val="en-IN"/>
+        </w:rPr>
+        <w:t xml:space="preserve"> Hacker hacks and get the session id either stored in browser cookie or url to prevent this we have to use https and also set valid time of a session id to less time.</w:t>
+      </w:r>
+    </w:p>
+    <w:p>
+      <w:pPr>
+        <w:rPr>
+          <w:rFonts w:hint="default"/>
+          <w:highlight w:val="none"/>
+          <w:lang w:val="en-IN"/>
+        </w:rPr>
+      </w:pPr>
+    </w:p>
+    <w:p>
+      <w:pPr>
+        <w:rPr>
+          <w:rFonts w:hint="default"/>
+          <w:highlight w:val="none"/>
+          <w:lang w:val="en-IN"/>
+        </w:rPr>
+      </w:pPr>
+      <w:r>
+        <w:rPr>
+          <w:rFonts w:hint="default"/>
+          <w:highlight w:val="red"/>
+          <w:lang w:val="en-IN"/>
+        </w:rPr>
+        <w:t>session fixation-</w:t>
+      </w:r>
+      <w:r>
+        <w:rPr>
+          <w:rFonts w:hint="default"/>
+          <w:highlight w:val="none"/>
+          <w:lang w:val="en-IN"/>
+        </w:rPr>
+        <w:t xml:space="preserve"> Hacker logins in and create a session and then sent a link to someone with session id in the url so once user click this link and login it will be given this same session id and then hacker can attack. To avoid this spring has inbuilt setup it uses sessionfixation (there is no need to mention if we use the default config of sessionfixation that is “change session” otherwise we need to mention if we want to use “newSession” or “migrate session”)</w:t>
+      </w:r>
+    </w:p>
+    <w:p>
+      <w:pPr>
+        <w:rPr>
+          <w:rFonts w:hint="default"/>
+          <w:highlight w:val="none"/>
+          <w:lang w:val="en-IN"/>
+        </w:rPr>
+      </w:pPr>
+    </w:p>
+    <w:p>
+      <w:pPr>
+        <w:rPr>
+          <w:rFonts w:hint="default"/>
+          <w:highlight w:val="none"/>
+          <w:lang w:val="en-IN"/>
+        </w:rPr>
+      </w:pPr>
+    </w:p>
+    <w:p>
+      <w:pPr>
+        <w:rPr>
+          <w:rFonts w:hint="default"/>
+          <w:highlight w:val="none"/>
+          <w:lang w:val="en-IN"/>
+        </w:rPr>
+      </w:pPr>
+      <w:r>
+        <w:rPr>
+          <w:rFonts w:hint="default"/>
+          <w:highlight w:val="cyan"/>
+          <w:lang w:val="en-IN"/>
+        </w:rPr>
+        <w:t>AutheticationEvents</w:t>
+      </w:r>
+      <w:r>
+        <w:rPr>
+          <w:rFonts w:hint="default"/>
+          <w:highlight w:val="none"/>
+          <w:lang w:val="en-IN"/>
+        </w:rPr>
+        <w:t xml:space="preserve"> (Triggers when success or failure of authentication happens and we can do what we want then (real life example sent email))</w:t>
       </w:r>
     </w:p>
     <w:p>
@@ -1231,6 +1283,32 @@
           <w:lang w:val="en-IN"/>
         </w:rPr>
         <w:t>AbstractAutheticationFailtureEvent</w:t>
+      </w:r>
+    </w:p>
+    <w:p>
+      <w:pPr>
+        <w:rPr>
+          <w:rFonts w:hint="default"/>
+          <w:highlight w:val="none"/>
+          <w:lang w:val="en-IN"/>
+        </w:rPr>
+      </w:pPr>
+    </w:p>
+    <w:p>
+      <w:pPr>
+        <w:rPr>
+          <w:rFonts w:hint="default"/>
+          <w:highlight w:val="cyan"/>
+          <w:lang w:val="en-IN"/>
+        </w:rPr>
+      </w:pPr>
+      <w:r>
+        <w:rPr>
+          <w:rFonts w:hint="default"/>
+          <w:highlight w:val="cyan"/>
+          <w:lang w:val="en-IN"/>
+        </w:rPr>
+        <w:t>But if we want to redirect we cant use the above we need to use .successHandles .FalitureHandler in formLogin see in easyBank Project</w:t>
       </w:r>
     </w:p>
     <w:p>

</xml_diff>

<commit_message>
Done all backend changes needed for JWT setup
</commit_message>
<xml_diff>
--- a/Important things.docx
+++ b/Important things.docx
@@ -1595,6 +1595,284 @@
     <w:p>
       <w:pPr>
         <w:rPr>
+          <w:rFonts w:ascii="SimSun" w:hAnsi="SimSun" w:eastAsia="SimSun" w:cs="SimSun"/>
+          <w:sz w:val="24"/>
+          <w:szCs w:val="24"/>
+          <w:highlight w:val="cyan"/>
+        </w:rPr>
+      </w:pPr>
+    </w:p>
+    <w:p>
+      <w:pPr>
+        <w:rPr>
+          <w:rFonts w:hint="default"/>
+          <w:highlight w:val="cyan"/>
+          <w:lang w:val="en-IN"/>
+        </w:rPr>
+      </w:pPr>
+      <w:r>
+        <w:rPr>
+          <w:rFonts w:hint="default"/>
+          <w:highlight w:val="cyan"/>
+          <w:lang w:val="en-IN"/>
+        </w:rPr>
+        <w:t xml:space="preserve">Token are 2 types </w:t>
+      </w:r>
+    </w:p>
+    <w:p>
+      <w:pPr>
+        <w:rPr>
+          <w:rFonts w:hint="default"/>
+          <w:highlight w:val="cyan"/>
+          <w:lang w:val="en-IN"/>
+        </w:rPr>
+      </w:pPr>
+    </w:p>
+    <w:p>
+      <w:pPr>
+        <w:rPr>
+          <w:rFonts w:hint="default"/>
+          <w:highlight w:val="none"/>
+          <w:lang w:val="en-IN"/>
+        </w:rPr>
+      </w:pPr>
+      <w:r>
+        <w:rPr>
+          <w:rFonts w:hint="default"/>
+          <w:highlight w:val="none"/>
+          <w:lang w:val="en-IN"/>
+        </w:rPr>
+        <w:t>opaque token-There is no meaning for the string generated and to validate the token sent by client it must access server (auth server).  example (session based token)</w:t>
+      </w:r>
+    </w:p>
+    <w:p>
+      <w:pPr>
+        <w:rPr>
+          <w:rFonts w:hint="default"/>
+          <w:highlight w:val="none"/>
+          <w:lang w:val="en-IN"/>
+        </w:rPr>
+      </w:pPr>
+      <w:r>
+        <w:rPr>
+          <w:rFonts w:hint="default"/>
+          <w:highlight w:val="none"/>
+          <w:lang w:val="en-IN"/>
+        </w:rPr>
+        <w:t>jwt token-It contains meaning (userdetails,expirydate etc) to validate no need to sent token to auth server</w:t>
+      </w:r>
+    </w:p>
+    <w:p>
+      <w:pPr>
+        <w:rPr>
+          <w:rFonts w:hint="default"/>
+          <w:highlight w:val="none"/>
+          <w:lang w:val="en-IN"/>
+        </w:rPr>
+      </w:pPr>
+    </w:p>
+    <w:p>
+      <w:pPr>
+        <w:rPr>
+          <w:rFonts w:hint="default"/>
+          <w:highlight w:val="cyan"/>
+          <w:lang w:val="en-IN"/>
+        </w:rPr>
+      </w:pPr>
+      <w:r>
+        <w:rPr>
+          <w:rFonts w:hint="default"/>
+          <w:highlight w:val="cyan"/>
+          <w:lang w:val="en-IN"/>
+        </w:rPr>
+        <w:t>JWT token</w:t>
+      </w:r>
+    </w:p>
+    <w:p>
+      <w:pPr>
+        <w:rPr>
+          <w:rFonts w:hint="default"/>
+          <w:highlight w:val="cyan"/>
+          <w:lang w:val="en-IN"/>
+        </w:rPr>
+      </w:pPr>
+    </w:p>
+    <w:p>
+      <w:pPr>
+        <w:rPr>
+          <w:rFonts w:hint="default"/>
+          <w:highlight w:val="none"/>
+          <w:lang w:val="en-IN"/>
+        </w:rPr>
+      </w:pPr>
+      <w:r>
+        <w:rPr>
+          <w:rFonts w:hint="default"/>
+          <w:highlight w:val="none"/>
+          <w:lang w:val="en-IN"/>
+        </w:rPr>
+        <w:t xml:space="preserve"> bascially in a jwt we have header,payload,signature, here we are getting details in the payload</w:t>
+      </w:r>
+    </w:p>
+    <w:p>
+      <w:pPr>
+        <w:rPr>
+          <w:rFonts w:hint="default"/>
+          <w:highlight w:val="none"/>
+          <w:lang w:val="en-IN"/>
+        </w:rPr>
+      </w:pPr>
+      <w:r>
+        <w:rPr>
+          <w:rFonts w:hint="default"/>
+          <w:highlight w:val="none"/>
+          <w:lang w:val="en-IN"/>
+        </w:rPr>
+        <w:t xml:space="preserve">     payload usally look like</w:t>
+      </w:r>
+    </w:p>
+    <w:p>
+      <w:pPr>
+        <w:rPr>
+          <w:rFonts w:hint="default"/>
+          <w:highlight w:val="none"/>
+          <w:lang w:val="en-IN"/>
+        </w:rPr>
+      </w:pPr>
+      <w:r>
+        <w:rPr>
+          <w:rFonts w:hint="default"/>
+          <w:highlight w:val="none"/>
+          <w:lang w:val="en-IN"/>
+        </w:rPr>
+        <w:t xml:space="preserve">      {</w:t>
+      </w:r>
+    </w:p>
+    <w:p>
+      <w:pPr>
+        <w:rPr>
+          <w:rFonts w:hint="default"/>
+          <w:highlight w:val="none"/>
+          <w:lang w:val="en-IN"/>
+        </w:rPr>
+      </w:pPr>
+      <w:r>
+        <w:rPr>
+          <w:rFonts w:hint="default"/>
+          <w:highlight w:val="none"/>
+          <w:lang w:val="en-IN"/>
+        </w:rPr>
+        <w:t xml:space="preserve">               "sub": "susan",</w:t>
+      </w:r>
+    </w:p>
+    <w:p>
+      <w:pPr>
+        <w:rPr>
+          <w:rFonts w:hint="default"/>
+          <w:highlight w:val="none"/>
+          <w:lang w:val="en-IN"/>
+        </w:rPr>
+      </w:pPr>
+      <w:r>
+        <w:rPr>
+          <w:rFonts w:hint="default"/>
+          <w:highlight w:val="none"/>
+          <w:lang w:val="en-IN"/>
+        </w:rPr>
+        <w:t xml:space="preserve">                "iat": 1786289278,</w:t>
+      </w:r>
+    </w:p>
+    <w:p>
+      <w:pPr>
+        <w:rPr>
+          <w:rFonts w:hint="default"/>
+          <w:highlight w:val="none"/>
+          <w:lang w:val="en-IN"/>
+        </w:rPr>
+      </w:pPr>
+      <w:r>
+        <w:rPr>
+          <w:rFonts w:hint="default"/>
+          <w:highlight w:val="none"/>
+          <w:lang w:val="en-IN"/>
+        </w:rPr>
+        <w:t xml:space="preserve">                "exp": 1786291078</w:t>
+      </w:r>
+    </w:p>
+    <w:p>
+      <w:pPr>
+        <w:rPr>
+          <w:rFonts w:hint="default"/>
+          <w:highlight w:val="none"/>
+          <w:lang w:val="en-IN"/>
+        </w:rPr>
+      </w:pPr>
+      <w:r>
+        <w:rPr>
+          <w:rFonts w:hint="default"/>
+          <w:highlight w:val="none"/>
+          <w:lang w:val="en-IN"/>
+        </w:rPr>
+        <w:t xml:space="preserve">       }</w:t>
+      </w:r>
+      <w:r>
+        <w:rPr>
+          <w:rFonts w:hint="default"/>
+          <w:highlight w:val="none"/>
+          <w:lang w:val="en-IN"/>
+        </w:rPr>
+        <w:br w:type="textWrapping"/>
+      </w:r>
+      <w:bookmarkStart w:id="0" w:name="_GoBack"/>
+      <w:bookmarkEnd w:id="0"/>
+      <w:r>
+        <w:rPr>
+          <w:rFonts w:hint="default"/>
+          <w:highlight w:val="none"/>
+          <w:lang w:val="en-IN"/>
+        </w:rPr>
+        <w:br w:type="textWrapping"/>
+      </w:r>
+      <w:r>
+        <w:rPr>
+          <w:rFonts w:hint="default"/>
+          <w:highlight w:val="none"/>
+          <w:lang w:val="en-IN"/>
+        </w:rPr>
+        <w:t>signature is a combination of header, payload and secret key</w:t>
+      </w:r>
+    </w:p>
+    <w:p>
+      <w:pPr>
+        <w:rPr>
+          <w:rFonts w:hint="default"/>
+          <w:highlight w:val="none"/>
+          <w:lang w:val="en-IN"/>
+        </w:rPr>
+      </w:pPr>
+    </w:p>
+    <w:p>
+      <w:pPr>
+        <w:rPr>
+          <w:rFonts w:hint="default"/>
+          <w:highlight w:val="none"/>
+          <w:lang w:val="en-IN"/>
+        </w:rPr>
+      </w:pPr>
+    </w:p>
+    <w:p>
+      <w:pPr>
+        <w:rPr>
+          <w:rFonts w:ascii="SimSun" w:hAnsi="SimSun" w:eastAsia="SimSun" w:cs="SimSun"/>
+          <w:sz w:val="24"/>
+          <w:szCs w:val="24"/>
+          <w:highlight w:val="cyan"/>
+        </w:rPr>
+      </w:pPr>
+    </w:p>
+    <w:p>
+      <w:pPr>
+        <w:rPr>
           <w:rFonts w:hint="default" w:ascii="SimSun" w:hAnsi="SimSun" w:eastAsia="SimSun" w:cs="SimSun"/>
           <w:sz w:val="24"/>
           <w:szCs w:val="24"/>
@@ -1602,8 +1880,6 @@
           <w:lang w:val="en-IN"/>
         </w:rPr>
       </w:pPr>
-      <w:bookmarkStart w:id="0" w:name="_GoBack"/>
-      <w:bookmarkEnd w:id="0"/>
     </w:p>
     <w:sectPr>
       <w:pgSz w:w="11906" w:h="16838"/>

</xml_diff>

<commit_message>
Creating Custom Authetication Manager
</commit_message>
<xml_diff>
--- a/Important things.docx
+++ b/Important things.docx
@@ -1823,24 +1823,103 @@
         </w:rPr>
         <w:br w:type="textWrapping"/>
       </w:r>
+      <w:r>
+        <w:rPr>
+          <w:rFonts w:hint="default"/>
+          <w:highlight w:val="none"/>
+          <w:lang w:val="en-IN"/>
+        </w:rPr>
+        <w:br w:type="textWrapping"/>
+      </w:r>
+      <w:r>
+        <w:rPr>
+          <w:rFonts w:hint="default"/>
+          <w:highlight w:val="none"/>
+          <w:lang w:val="en-IN"/>
+        </w:rPr>
+        <w:t>signature is a combination of header, payload and secret key</w:t>
+      </w:r>
+    </w:p>
+    <w:p>
+      <w:pPr>
+        <w:rPr>
+          <w:rFonts w:hint="default"/>
+          <w:highlight w:val="none"/>
+          <w:lang w:val="en-IN"/>
+        </w:rPr>
+      </w:pPr>
+    </w:p>
+    <w:p>
+      <w:pPr>
+        <w:rPr>
+          <w:rFonts w:hint="default"/>
+          <w:highlight w:val="cyan"/>
+          <w:lang w:val="en-IN"/>
+        </w:rPr>
+      </w:pPr>
+      <w:r>
+        <w:rPr>
+          <w:rFonts w:hint="default"/>
+          <w:highlight w:val="cyan"/>
+          <w:lang w:val="en-IN"/>
+        </w:rPr>
+        <w:t xml:space="preserve">Custom authentication manager </w:t>
+      </w:r>
+    </w:p>
+    <w:p>
+      <w:pPr>
+        <w:rPr>
+          <w:rFonts w:hint="default"/>
+          <w:highlight w:val="none"/>
+          <w:lang w:val="en-IN"/>
+        </w:rPr>
+      </w:pPr>
+    </w:p>
+    <w:p>
+      <w:pPr>
+        <w:rPr>
+          <w:rFonts w:hint="default"/>
+          <w:highlight w:val="none"/>
+          <w:lang w:val="en-IN"/>
+        </w:rPr>
+      </w:pPr>
+      <w:r>
+        <w:rPr>
+          <w:rFonts w:hint="default"/>
+          <w:highlight w:val="none"/>
+          <w:lang w:val="en-IN"/>
+        </w:rPr>
+        <w:t>If we don’t want to use filters like (basicAuthenticationFilter and UserNamePasswordFilter) these usally calls Autheitcation Manager internally if we don’t use that then we make our own Authetication Manager</w:t>
+      </w:r>
+    </w:p>
+    <w:p>
+      <w:pPr>
+        <w:rPr>
+          <w:rFonts w:hint="default"/>
+          <w:highlight w:val="none"/>
+          <w:lang w:val="en-IN"/>
+        </w:rPr>
+      </w:pPr>
+    </w:p>
+    <w:p>
+      <w:pPr>
+        <w:rPr>
+          <w:rFonts w:hint="default"/>
+          <w:highlight w:val="none"/>
+          <w:lang w:val="en-IN"/>
+        </w:rPr>
+      </w:pPr>
+    </w:p>
+    <w:p>
+      <w:pPr>
+        <w:rPr>
+          <w:rFonts w:hint="default"/>
+          <w:highlight w:val="none"/>
+          <w:lang w:val="en-IN"/>
+        </w:rPr>
+      </w:pPr>
       <w:bookmarkStart w:id="0" w:name="_GoBack"/>
       <w:bookmarkEnd w:id="0"/>
-      <w:r>
-        <w:rPr>
-          <w:rFonts w:hint="default"/>
-          <w:highlight w:val="none"/>
-          <w:lang w:val="en-IN"/>
-        </w:rPr>
-        <w:br w:type="textWrapping"/>
-      </w:r>
-      <w:r>
-        <w:rPr>
-          <w:rFonts w:hint="default"/>
-          <w:highlight w:val="none"/>
-          <w:lang w:val="en-IN"/>
-        </w:rPr>
-        <w:t>signature is a combination of header, payload and secret key</w:t>
-      </w:r>
     </w:p>
     <w:p>
       <w:pPr>

</xml_diff>

<commit_message>
Method level security. Learning Invocation (PreAuthorize,PostAuthorize) and Filtering (PreFilter and PostFilter)
</commit_message>
<xml_diff>
--- a/Important things.docx
+++ b/Important things.docx
@@ -101,6 +101,139 @@
         <w:rPr>
           <w:rFonts w:hint="default"/>
           <w:highlight w:val="cyan"/>
+          <w:lang w:val="en-IN"/>
+        </w:rPr>
+      </w:pPr>
+      <w:r>
+        <w:rPr>
+          <w:rFonts w:hint="default"/>
+          <w:highlight w:val="cyan"/>
+          <w:lang w:val="en-IN"/>
+        </w:rPr>
+        <w:t xml:space="preserve">If basicAutheitcation is on </w:t>
+      </w:r>
+    </w:p>
+    <w:p>
+      <w:pPr>
+        <w:rPr>
+          <w:rFonts w:hint="default"/>
+        </w:rPr>
+      </w:pPr>
+    </w:p>
+    <w:p>
+      <w:pPr>
+        <w:rPr>
+          <w:rFonts w:hint="default"/>
+          <w:lang w:val="en-IN"/>
+        </w:rPr>
+      </w:pPr>
+      <w:r>
+        <w:rPr>
+          <w:rFonts w:hint="default"/>
+          <w:lang w:val="en-IN"/>
+        </w:rPr>
+        <w:t xml:space="preserve">We have to send data in header as Authorization: basic (Enocoded value of username and pasword) from frontend and this is taken by basicAutheticationFilter and rest it will do (calls default authetication manager and then authentication provider).For subsequent calls also we need to sent in header the Authorization: basic (Enocoded value of username and pasword) </w:t>
+      </w:r>
+    </w:p>
+    <w:p>
+      <w:pPr>
+        <w:rPr>
+          <w:rFonts w:hint="default"/>
+          <w:lang w:val="en-IN"/>
+        </w:rPr>
+      </w:pPr>
+    </w:p>
+    <w:p>
+      <w:pPr>
+        <w:rPr>
+          <w:rFonts w:hint="default"/>
+          <w:highlight w:val="cyan"/>
+          <w:lang w:val="en-IN"/>
+        </w:rPr>
+      </w:pPr>
+      <w:r>
+        <w:rPr>
+          <w:rFonts w:hint="default"/>
+          <w:highlight w:val="cyan"/>
+          <w:lang w:val="en-IN"/>
+        </w:rPr>
+        <w:t>If Formlogin is on and we want it to be used</w:t>
+      </w:r>
+    </w:p>
+    <w:p>
+      <w:pPr>
+        <w:rPr>
+          <w:rFonts w:hint="default"/>
+          <w:highlight w:val="cyan"/>
+          <w:lang w:val="en-IN"/>
+        </w:rPr>
+      </w:pPr>
+    </w:p>
+    <w:p>
+      <w:pPr>
+        <w:rPr>
+          <w:rFonts w:hint="default"/>
+          <w:highlight w:val="none"/>
+          <w:lang w:val="en-IN"/>
+        </w:rPr>
+      </w:pPr>
+      <w:r>
+        <w:rPr>
+          <w:rFonts w:hint="default"/>
+          <w:highlight w:val="none"/>
+          <w:lang w:val="en-IN"/>
+        </w:rPr>
+        <w:t>To use that from frontend we have to sent data to /log</w:t>
+      </w:r>
+      <w:bookmarkStart w:id="0" w:name="_GoBack"/>
+      <w:bookmarkEnd w:id="0"/>
+      <w:r>
+        <w:rPr>
+          <w:rFonts w:hint="default"/>
+          <w:highlight w:val="none"/>
+          <w:lang w:val="en-IN"/>
+        </w:rPr>
+        <w:t>in default page (no need to mention anywhere spring knows it) when we send data it should be of the form “x-www-form-urlenocoded” format not in json format and it is then intercepted by UserNamePasswordAuthenticationFilter and rest it will do. Subsequent calls there is no need to do anything browser will automatically sent the cookie for authentication</w:t>
+      </w:r>
+    </w:p>
+    <w:p>
+      <w:pPr>
+        <w:rPr>
+          <w:rFonts w:hint="default"/>
+          <w:highlight w:val="none"/>
+          <w:lang w:val="en-IN"/>
+        </w:rPr>
+      </w:pPr>
+    </w:p>
+    <w:p>
+      <w:pPr>
+        <w:rPr>
+          <w:rFonts w:hint="default"/>
+          <w:highlight w:val="cyan"/>
+          <w:lang w:val="en-IN"/>
+        </w:rPr>
+      </w:pPr>
+      <w:r>
+        <w:rPr>
+          <w:rFonts w:hint="default"/>
+          <w:highlight w:val="cyan"/>
+          <w:lang w:val="en-IN"/>
+        </w:rPr>
+        <w:t>If we don’t use both way and create custom /login controller then we have to create our own authentication manager and do the authentication manually (we can also if needed create and call custom authetication provider)</w:t>
+      </w:r>
+    </w:p>
+    <w:p>
+      <w:pPr>
+        <w:rPr>
+          <w:rFonts w:hint="default"/>
+        </w:rPr>
+      </w:pPr>
+    </w:p>
+    <w:p>
+      <w:pPr>
+        <w:rPr>
+          <w:rFonts w:hint="default"/>
+          <w:highlight w:val="cyan"/>
         </w:rPr>
       </w:pPr>
       <w:r>
@@ -1905,21 +2038,330 @@
       <w:pPr>
         <w:rPr>
           <w:rFonts w:hint="default"/>
-          <w:highlight w:val="none"/>
-          <w:lang w:val="en-IN"/>
-        </w:rPr>
-      </w:pPr>
-    </w:p>
-    <w:p>
-      <w:pPr>
-        <w:rPr>
-          <w:rFonts w:hint="default"/>
-          <w:highlight w:val="none"/>
-          <w:lang w:val="en-IN"/>
-        </w:rPr>
-      </w:pPr>
-      <w:bookmarkStart w:id="0" w:name="_GoBack"/>
-      <w:bookmarkEnd w:id="0"/>
+          <w:highlight w:val="cyan"/>
+          <w:lang w:val="en-IN"/>
+        </w:rPr>
+      </w:pPr>
+      <w:r>
+        <w:rPr>
+          <w:rFonts w:hint="default"/>
+          <w:highlight w:val="cyan"/>
+          <w:lang w:val="en-IN"/>
+        </w:rPr>
+        <w:t>Method level security</w:t>
+      </w:r>
+    </w:p>
+    <w:p>
+      <w:pPr>
+        <w:rPr>
+          <w:rFonts w:hint="default"/>
+          <w:highlight w:val="cyan"/>
+          <w:lang w:val="en-IN"/>
+        </w:rPr>
+      </w:pPr>
+    </w:p>
+    <w:p>
+      <w:pPr>
+        <w:rPr>
+          <w:rFonts w:hint="default"/>
+          <w:highlight w:val="none"/>
+          <w:lang w:val="en-IN"/>
+        </w:rPr>
+      </w:pPr>
+      <w:r>
+        <w:rPr>
+          <w:rFonts w:hint="default"/>
+          <w:highlight w:val="none"/>
+          <w:lang w:val="en-IN"/>
+        </w:rPr>
+        <w:t>@EnableMethodSecurity add this in main file to enable method level security</w:t>
+      </w:r>
+    </w:p>
+    <w:p>
+      <w:pPr>
+        <w:rPr>
+          <w:rFonts w:hint="default"/>
+          <w:highlight w:val="cyan"/>
+          <w:lang w:val="en-IN"/>
+        </w:rPr>
+      </w:pPr>
+    </w:p>
+    <w:p>
+      <w:pPr>
+        <w:rPr>
+          <w:rFonts w:hint="default"/>
+          <w:highlight w:val="cyan"/>
+          <w:lang w:val="en-IN"/>
+        </w:rPr>
+      </w:pPr>
+      <w:r>
+        <w:rPr>
+          <w:rFonts w:hint="default"/>
+          <w:highlight w:val="cyan"/>
+          <w:lang w:val="en-IN"/>
+        </w:rPr>
+        <w:t xml:space="preserve">There Are 2 Type </w:t>
+      </w:r>
+    </w:p>
+    <w:p>
+      <w:pPr>
+        <w:rPr>
+          <w:rFonts w:hint="default"/>
+          <w:highlight w:val="cyan"/>
+          <w:lang w:val="en-IN"/>
+        </w:rPr>
+      </w:pPr>
+    </w:p>
+    <w:p>
+      <w:pPr>
+        <w:rPr>
+          <w:rFonts w:hint="default"/>
+          <w:highlight w:val="cyan"/>
+          <w:lang w:val="en-IN"/>
+        </w:rPr>
+      </w:pPr>
+      <w:r>
+        <w:rPr>
+          <w:rFonts w:hint="default"/>
+          <w:highlight w:val="red"/>
+          <w:lang w:val="en-IN"/>
+        </w:rPr>
+        <w:t>Invocation-</w:t>
+      </w:r>
+      <w:r>
+        <w:rPr>
+          <w:rFonts w:hint="default"/>
+          <w:highlight w:val="none"/>
+          <w:lang w:val="en-IN"/>
+        </w:rPr>
+        <w:t>Decides who can call a method depending upon role and authorities</w:t>
+      </w:r>
+    </w:p>
+    <w:p>
+      <w:pPr>
+        <w:rPr>
+          <w:rFonts w:hint="default"/>
+          <w:highlight w:val="cyan"/>
+          <w:lang w:val="en-IN"/>
+        </w:rPr>
+      </w:pPr>
+    </w:p>
+    <w:p>
+      <w:pPr>
+        <w:rPr>
+          <w:rFonts w:hint="default"/>
+          <w:highlight w:val="none"/>
+          <w:lang w:val="en-IN"/>
+        </w:rPr>
+      </w:pPr>
+      <w:r>
+        <w:rPr>
+          <w:rFonts w:hint="default"/>
+          <w:highlight w:val="none"/>
+          <w:lang w:val="en-IN"/>
+        </w:rPr>
+        <w:t xml:space="preserve">Can be achieved by using </w:t>
+      </w:r>
+    </w:p>
+    <w:p>
+      <w:pPr>
+        <w:rPr>
+          <w:rFonts w:hint="default"/>
+          <w:highlight w:val="none"/>
+          <w:lang w:val="en-IN"/>
+        </w:rPr>
+      </w:pPr>
+    </w:p>
+    <w:p>
+      <w:pPr>
+        <w:rPr>
+          <w:rFonts w:hint="default"/>
+          <w:highlight w:val="none"/>
+          <w:lang w:val="en-IN"/>
+        </w:rPr>
+      </w:pPr>
+      <w:r>
+        <w:rPr>
+          <w:rFonts w:hint="default"/>
+          <w:highlight w:val="none"/>
+          <w:lang w:val="en-IN"/>
+        </w:rPr>
+        <w:t>@PreAuthorize- run validation check before method execution</w:t>
+      </w:r>
+    </w:p>
+    <w:p>
+      <w:pPr>
+        <w:rPr>
+          <w:rFonts w:hint="default"/>
+          <w:highlight w:val="none"/>
+          <w:lang w:val="en-IN"/>
+        </w:rPr>
+      </w:pPr>
+      <w:r>
+        <w:rPr>
+          <w:rFonts w:hint="default"/>
+          <w:highlight w:val="none"/>
+          <w:lang w:val="en-IN"/>
+        </w:rPr>
+        <w:t>@PostAuthorize-run validation cehck after method execution</w:t>
+      </w:r>
+    </w:p>
+    <w:p>
+      <w:pPr>
+        <w:rPr>
+          <w:rFonts w:hint="default"/>
+          <w:highlight w:val="none"/>
+          <w:lang w:val="en-IN"/>
+        </w:rPr>
+      </w:pPr>
+    </w:p>
+    <w:p>
+      <w:pPr>
+        <w:rPr>
+          <w:rFonts w:hint="default"/>
+          <w:highlight w:val="none"/>
+          <w:lang w:val="en-IN"/>
+        </w:rPr>
+      </w:pPr>
+      <w:r>
+        <w:rPr>
+          <w:rFonts w:hint="default"/>
+          <w:highlight w:val="red"/>
+          <w:lang w:val="en-IN"/>
+        </w:rPr>
+        <w:t>Filtering-</w:t>
+      </w:r>
+      <w:r>
+        <w:rPr>
+          <w:rFonts w:hint="default"/>
+          <w:highlight w:val="none"/>
+          <w:lang w:val="en-IN"/>
+        </w:rPr>
+        <w:t>Validate what a method can receive as its parameter and what an invoker can receive back</w:t>
+      </w:r>
+    </w:p>
+    <w:p>
+      <w:pPr>
+        <w:rPr>
+          <w:rFonts w:hint="default"/>
+          <w:highlight w:val="none"/>
+          <w:lang w:val="en-IN"/>
+        </w:rPr>
+      </w:pPr>
+    </w:p>
+    <w:p>
+      <w:pPr>
+        <w:rPr>
+          <w:rFonts w:hint="default"/>
+          <w:highlight w:val="none"/>
+          <w:lang w:val="en-IN"/>
+        </w:rPr>
+      </w:pPr>
+      <w:r>
+        <w:rPr>
+          <w:rFonts w:hint="default"/>
+          <w:highlight w:val="none"/>
+          <w:lang w:val="en-IN"/>
+        </w:rPr>
+        <w:t xml:space="preserve">Can be achieved by using </w:t>
+      </w:r>
+    </w:p>
+    <w:p>
+      <w:pPr>
+        <w:rPr>
+          <w:rFonts w:hint="default"/>
+          <w:highlight w:val="none"/>
+          <w:lang w:val="en-IN"/>
+        </w:rPr>
+      </w:pPr>
+    </w:p>
+    <w:p>
+      <w:pPr>
+        <w:rPr>
+          <w:rFonts w:hint="default"/>
+          <w:highlight w:val="none"/>
+          <w:lang w:val="en-IN"/>
+        </w:rPr>
+      </w:pPr>
+      <w:r>
+        <w:rPr>
+          <w:rFonts w:hint="default"/>
+          <w:highlight w:val="none"/>
+          <w:lang w:val="en-IN"/>
+        </w:rPr>
+        <w:t xml:space="preserve">@PreFilter -These work only when the input is collections like “list” </w:t>
+      </w:r>
+    </w:p>
+    <w:p>
+      <w:pPr>
+        <w:rPr>
+          <w:rFonts w:hint="default"/>
+          <w:highlight w:val="none"/>
+          <w:lang w:val="en-IN"/>
+        </w:rPr>
+      </w:pPr>
+    </w:p>
+    <w:p>
+      <w:pPr>
+        <w:rPr>
+          <w:rFonts w:hint="default"/>
+          <w:highlight w:val="none"/>
+          <w:lang w:val="en-IN"/>
+        </w:rPr>
+      </w:pPr>
+      <w:r>
+        <w:rPr>
+          <w:rFonts w:hint="default"/>
+          <w:highlight w:val="none"/>
+          <w:lang w:val="en-IN"/>
+        </w:rPr>
+        <w:t xml:space="preserve">@PostFilter-These work only when the output is collections like “list” </w:t>
+      </w:r>
+    </w:p>
+    <w:p>
+      <w:pPr>
+        <w:rPr>
+          <w:rFonts w:hint="default"/>
+          <w:highlight w:val="none"/>
+          <w:lang w:val="en-IN"/>
+        </w:rPr>
+      </w:pPr>
+    </w:p>
+    <w:p>
+      <w:pPr>
+        <w:rPr>
+          <w:rFonts w:hint="default"/>
+          <w:highlight w:val="none"/>
+          <w:lang w:val="en-IN"/>
+        </w:rPr>
+      </w:pPr>
+    </w:p>
+    <w:p>
+      <w:pPr>
+        <w:rPr>
+          <w:rFonts w:hint="default"/>
+          <w:highlight w:val="none"/>
+          <w:lang w:val="en-IN"/>
+        </w:rPr>
+      </w:pPr>
+    </w:p>
+    <w:p>
+      <w:pPr>
+        <w:rPr>
+          <w:rFonts w:hint="default"/>
+          <w:highlight w:val="none"/>
+          <w:lang w:val="en-IN"/>
+        </w:rPr>
+      </w:pPr>
+    </w:p>
+    <w:p>
+      <w:pPr>
+        <w:rPr>
+          <w:rFonts w:hint="default"/>
+          <w:highlight w:val="none"/>
+          <w:lang w:val="en-IN"/>
+        </w:rPr>
+      </w:pPr>
     </w:p>
     <w:p>
       <w:pPr>

</xml_diff>